<commit_message>
Update patent doc with natural language text
</commit_message>
<xml_diff>
--- a/专利申请技术交底书_Warp动态调度.docx
+++ b/专利申请技术交底书_Warp动态调度.docx
@@ -58,7 +58,7 @@
         <w:spacing w:after="150"/>
       </w:pPr>
       <w:r>
-        <w:t xml:space="preserve">☐ 发明； ☒ 实用新型； ☐ 外观设计； ☐ 作为技术秘密保护； ☐ 不申请。</w:t>
+        <w:t xml:space="preserve">□ 发明； □ 实用新型； □ 外观设计； □ 作为技术秘密保护； □ 不申请。</w:t>
       </w:r>
     </w:p>
     <w:p>
@@ -66,7 +66,7 @@
         <w:spacing w:after="300"/>
       </w:pPr>
       <w:r>
-        <w:t xml:space="preserve">申请人：☒ 成都海光集成电路设计有限公司； ☐ 成都海光微电子技术有限公司； ☐ 海光信息技术有限公司。</w:t>
+        <w:t xml:space="preserve">申请人：☑ 成都海光集成电路设计有限公司； □ 成都海光微电子技术有限公司； □ 海光信息技术有限公司。</w:t>
       </w:r>
     </w:p>
     <w:p>
@@ -162,15 +162,7 @@
         <w:spacing w:after="80"/>
       </w:pPr>
       <w:r>
-        <w:t xml:space="preserve">关键词：</w:t>
-      </w:r>
-    </w:p>
-    <w:p>
-      <w:pPr>
-        <w:spacing w:after="80"/>
-      </w:pPr>
-      <w:r>
-        <w:t xml:space="preserve">中文：Warp 调度、GPU 编译器、Warp-Specialize、动态调度、Kernel 优化、DCU、Triton、硬件资源利用、线程束特化</w:t>
+        <w:t xml:space="preserve">关键词（中文）：Warp 调度、GPU 编译器、Warp-Specialize、动态调度、Kernel 优化、DCU、Triton、硬件资源利用、线程束特化</w:t>
       </w:r>
     </w:p>
     <w:p>
@@ -178,7 +170,7 @@
         <w:spacing w:after="300"/>
       </w:pPr>
       <w:r>
-        <w:t xml:space="preserve">English：Warp Scheduling, GPU Compiler, Warp-Specialize, Dynamic Scheduling, Kernel Optimization, DCU, Triton, Hardware Resource Utilization, Thread Warp Specialization</w:t>
+        <w:t xml:space="preserve">关键词（English）：Warp Scheduling, GPU Compiler, Warp-Specialize, Dynamic Scheduling, Kernel Optimization, DCU, Triton, Hardware Resource Utilization, Thread Warp Specialization</w:t>
       </w:r>
     </w:p>
     <w:p>
@@ -195,7 +187,7 @@
         <w:spacing w:after="400"/>
       </w:pPr>
       <w:r>
-        <w:t xml:space="preserve">☐ 未列入公司产品计划； ☑ 实施阶段，将在公司新产品中实施，拟应用产品为：_________________</w:t>
+        <w:t xml:space="preserve">□ 未列入公司产品计划； ☑ 实施阶段，将在公司新产品中实施，拟应用产品为：_________________</w:t>
       </w:r>
     </w:p>
     <w:p>
@@ -542,7 +534,7 @@
         <w:ind w:left="720"/>
       </w:pPr>
       <w:r>
-        <w:t xml:space="preserve">1. NVIDIA FlashAttention 系列：使用 Producer 线程预取数据，Consumer 线程执行注意力计算</w:t>
+        <w:t xml:space="preserve">（1）NVIDIA FlashAttention 系列：使用 Producer 线程预取数据，Consumer 线程执行注意力计算</w:t>
       </w:r>
     </w:p>
     <w:p>
@@ -551,7 +543,7 @@
         <w:ind w:left="720"/>
       </w:pPr>
       <w:r>
-        <w:t xml:space="preserve">2. AMD HIPKittens：提出了 8-wave ping-pong 调度模式</w:t>
+        <w:t xml:space="preserve">（2）AMD HIPKittens：提出了 8-wave ping-pong 调度模式</w:t>
       </w:r>
     </w:p>
     <w:p>
@@ -560,7 +552,7 @@
         <w:ind w:left="720"/>
       </w:pPr>
       <w:r>
-        <w:t xml:space="preserve">3. Triton 编译器：提供了 Warp-Specialize 的语言层面的支持</w:t>
+        <w:t xml:space="preserve">（3）Triton 编译器：提供了 Warp-Specialize 的语言层面的支持</w:t>
       </w:r>
     </w:p>
     <w:p>
@@ -897,7 +889,7 @@
               <w:jc w:val="center"/>
             </w:pPr>
             <w:r>
-              <w:t xml:space="preserve">编译时+固定阶段</w:t>
+              <w:t xml:space="preserve">编译时加固定阶段</w:t>
             </w:r>
           </w:p>
         </w:tc>
@@ -979,7 +971,7 @@
               <w:jc w:val="center"/>
             </w:pPr>
             <w:r>
-              <w:t xml:space="preserve">好（但开销大）</w:t>
+              <w:t xml:space="preserve">好但开销大</w:t>
             </w:r>
           </w:p>
         </w:tc>
@@ -1053,7 +1045,7 @@
               <w:jc w:val="center"/>
             </w:pPr>
             <w:r>
-              <w:t xml:space="preserve">编译时分区+运行时动态</w:t>
+              <w:t xml:space="preserve">编译时分区加运行时动态</w:t>
             </w:r>
           </w:p>
         </w:tc>
@@ -1099,7 +1091,7 @@
         <w:spacing w:after="400"/>
       </w:pPr>
       <w:r>
-        <w:t xml:space="preserve">与现有技术的区别：本发明首次提出了"编译时分区+运行时动态调度"的架构，通过引入 Daemon Warp 机制，实现了真正响应运行时硬件状态变化的动态 Warp 分工，在保证低开销的前提下实现了最优的资源利用率。</w:t>
+        <w:t xml:space="preserve">与现有技术的区别：本发明首次提出了"编译时分区加运行时动态调度"的架构，通过引入 Daemon Warp 机制，实现了真正响应运行时硬件状态变化的动态 Warp 分工，在保证低开销的前提下实现了最优的资源利用率。</w:t>
       </w:r>
     </w:p>
     <w:p>
@@ -1151,7 +1143,7 @@
         <w:ind w:left="720"/>
       </w:pPr>
       <w:r>
-        <w:t xml:space="preserve">1. 编译阶段：将 Kernel 按照使用的硬件单元划分为不同的分区（Partition），每个分区再按照数据维度切分为小的任务（Task），预计算每个 Task 需要的输入（内存地址、参数等），存储于共享内存的结构体中</w:t>
+        <w:t xml:space="preserve">（1）编译阶段：将 Kernel 按照使用的硬件单元划分为不同的分区（Partition），每个分区再按照数据维度切分为小的任务（Task），预计算每个 Task 需要的输入（内存地址、参数等），存储于共享内存的结构体中</w:t>
       </w:r>
     </w:p>
     <w:p>
@@ -1160,7 +1152,7 @@
         <w:ind w:left="720"/>
       </w:pPr>
       <w:r>
-        <w:t xml:space="preserve">2. 运行阶段：由一个特殊的 Warp 担任调度器（Daemon Warp），持续监控硬件资源占用情况，当有 Warp 空闲时，根据硬件状态选择合适的 Partition，根据数据依赖关系选择满足条件的 Task，分发给空闲的 Warp 执行</w:t>
+        <w:t xml:space="preserve">（2）运行阶段：由一个特殊的 Warp 担任调度器（Daemon Warp），持续监控硬件资源占用情况，当有 Warp 空闲时，根据硬件状态选择合适的 Partition，根据数据依赖关系选择满足条件的 Task，分发给空闲的 Warp 执行</w:t>
       </w:r>
     </w:p>
     <w:p>
@@ -1169,7 +1161,7 @@
         <w:ind w:left="720"/>
       </w:pPr>
       <w:r>
-        <w:t xml:space="preserve">3. 重复执行：重复上述过程直到所有 Task 执行完毕</w:t>
+        <w:t xml:space="preserve">（3）重复执行：重复上述过程直到所有 Task 执行完毕</w:t>
       </w:r>
     </w:p>
     <w:p>
@@ -1212,15 +1204,15 @@
         <w:spacing w:after="80"/>
       </w:pPr>
       <w:r>
-        <w:t xml:space="preserve">• 内存分区（Partition-M）：主要执行内存访问操作（Load/Store）的代码区域</w:t>
-      </w:r>
-    </w:p>
-    <w:p>
-      <w:pPr>
-        <w:spacing w:after="80"/>
-      </w:pPr>
-      <w:r>
-        <w:t xml:space="preserve">• 计算分区（Partition-C）：主要执行计算密集型操作（MFMA、ALU）的代码区域</w:t>
+        <w:t xml:space="preserve">内存分区（Partition-M）：主要执行内存访问操作（Load/Store）的代码区域</w:t>
+      </w:r>
+    </w:p>
+    <w:p>
+      <w:pPr>
+        <w:spacing w:after="80"/>
+      </w:pPr>
+      <w:r>
+        <w:t xml:space="preserve">计算分区（Partition-C）：主要执行计算密集型操作（MFMA、ALU）的代码区域</w:t>
       </w:r>
     </w:p>
     <w:p>
@@ -1228,7 +1220,7 @@
         <w:spacing w:after="200"/>
       </w:pPr>
       <w:r>
-        <w:t xml:space="preserve">• 混合分区（Partition-H）：同时包含内存和计算操作的代码区域</w:t>
+        <w:t xml:space="preserve">混合分区（Partition-H）：同时包含内存和计算操作的代码区域</w:t>
       </w:r>
     </w:p>
     <w:p>
@@ -1250,6 +1242,23 @@
     </w:p>
     <w:p>
       <w:pPr>
+        <w:pStyle w:val="Heading4"/>
+        <w:spacing w:after="100" w:before="150"/>
+      </w:pPr>
+      <w:r>
+        <w:t xml:space="preserve">3.1.3 调度代码生成</w:t>
+      </w:r>
+    </w:p>
+    <w:p>
+      <w:pPr>
+        <w:spacing w:after="200"/>
+      </w:pPr>
+      <w:r>
+        <w:t xml:space="preserve">编译阶段生成两部分代码：（1）Task 执行代码：每个 Task 的具体实现编译成的机器码；（2）Daemon 调度代码：运行时 Daemon Warp 执行的调度逻辑。</w:t>
+      </w:r>
+    </w:p>
+    <w:p>
+      <w:pPr>
         <w:pStyle w:val="Heading3"/>
         <w:spacing w:after="100" w:before="150"/>
       </w:pPr>
@@ -1305,7 +1314,7 @@
         <w:spacing w:after="400"/>
       </w:pPr>
       <w:r>
-        <w:t xml:space="preserve">本发明采用"编译时分区+运行时动态调度"的架构，与传统静态 Warp-Specialize 的核心区别在于：分工时机从编译时变为运行时，任务分配从固定角色变为 Daemon 根据状态动态分配，实现了真正的自适应负载均衡。</w:t>
+        <w:t xml:space="preserve">本发明采用"编译时分区加运行时动态调度"的架构，与传统静态 Warp-Specialize 的核心区别在于：分工时机从编译时变为运行时，任务分配从固定角色变为 Daemon 根据状态动态分配，实现了真正的自适应负载均衡。</w:t>
       </w:r>
     </w:p>
     <w:p>
@@ -1559,7 +1568,7 @@
         <w:spacing w:after="100"/>
       </w:pPr>
       <w:r>
-        <w:t xml:space="preserve">1. 编译阶段分析矩阵乘 Kernel，识别出 Partition-M：加载 A、B 矩阵块；Partition-C：MFMA 计算；Partition-H：计算 + 存储结果</w:t>
+        <w:t xml:space="preserve">（1）编译阶段分析矩阵乘 Kernel，识别出 Partition-M：加载 A、B 矩阵块；Partition-C：MFMA 计算；Partition-H：计算加存储结果</w:t>
       </w:r>
     </w:p>
     <w:p>
@@ -1567,7 +1576,7 @@
         <w:spacing w:after="100"/>
       </w:pPr>
       <w:r>
-        <w:t xml:space="preserve">2. 按数据维度切分 Task：每个输出块作为一个 Task，预计算每个块在共享内存的位置</w:t>
+        <w:t xml:space="preserve">（2）按数据维度切分 Task：每个输出块作为一个 Task，预计算每个块在共享内存的位置</w:t>
       </w:r>
     </w:p>
     <w:p>
@@ -1575,7 +1584,7 @@
         <w:spacing w:after="200"/>
       </w:pPr>
       <w:r>
-        <w:t xml:space="preserve">3. 运行时 Daemon 调度：当计算单元忙时，分配更多内存任务；当内存带宽满时，分配更多计算任务</w:t>
+        <w:t xml:space="preserve">（3）运行时 Daemon 调度：当计算单元忙时，分配更多内存任务；当内存带宽满时，分配更多计算任务</w:t>
       </w:r>
     </w:p>
     <w:p>
@@ -1592,7 +1601,7 @@
         <w:spacing w:after="100"/>
       </w:pPr>
       <w:r>
-        <w:t xml:space="preserve">1. 编译阶段识别：QKV 加载 → Partition-M；softmax 计算 → Partition-C；上下文存储 → Partition-M</w:t>
+        <w:t xml:space="preserve">（1）编译阶段识别：QKV 加载对应 Partition-M；softmax 计算对应 Partition-C；上下文存储对应 Partition-M</w:t>
       </w:r>
     </w:p>
     <w:p>
@@ -1600,7 +1609,7 @@
         <w:spacing w:after="100"/>
       </w:pPr>
       <w:r>
-        <w:t xml:space="preserve">2. 数据依赖关系：QKV 加载完成后才能执行 softmax；softmax 完成后才能存储结果</w:t>
+        <w:t xml:space="preserve">（2）数据依赖关系：QKV 加载完成后才能执行 softmax；softmax 完成后才能存储结果</w:t>
       </w:r>
     </w:p>
     <w:p>
@@ -1608,7 +1617,7 @@
         <w:spacing w:after="200"/>
       </w:pPr>
       <w:r>
-        <w:t xml:space="preserve">3. 运行时 Daemon 确保依赖满足后调度</w:t>
+        <w:t xml:space="preserve">（3）运行时 Daemon 确保依赖满足后调度</w:t>
       </w:r>
     </w:p>
     <w:p>
@@ -1643,7 +1652,7 @@
         <w:spacing w:after="100" w:before="200"/>
       </w:pPr>
       <w:r>
-        <w:t xml:space="preserve">1. 编译时分区 + 运行时动态调度的架构设计</w:t>
+        <w:t xml:space="preserve">1. 编译时分区加运行时动态调度的架构设计</w:t>
       </w:r>
     </w:p>
     <w:p>
@@ -1651,7 +1660,7 @@
         <w:spacing w:after="200"/>
       </w:pPr>
       <w:r>
-        <w:t xml:space="preserve">本发明首次提出了将 Kernel 在编译时按硬件单元使用类型划分为不同分区，并在运行时由 Daemon Warp 根据硬件状态动态调度任务的架构。这种"编译时分析 + 运行时决策"的模式，兼顾了编译优化的确定性和运行时自适应的灵活性。</w:t>
+        <w:t xml:space="preserve">本发明首次提出了将 Kernel 在编译时按硬件单元使用类型划分为不同分区，并在运行时由 Daemon Warp 根据硬件状态动态调度任务的架构。这种"编译时分析加运行时决策"的模式，兼顾了编译优化的确定性和运行时自适应的灵活性。</w:t>
       </w:r>
     </w:p>
     <w:p>
@@ -1736,39 +1745,39 @@
         <w:spacing w:after="80"/>
       </w:pPr>
       <w:r>
-        <w:t xml:space="preserve">图1：传统静态 Warp-Specialize 示意</w:t>
-      </w:r>
-    </w:p>
-    <w:p>
-      <w:pPr>
-        <w:spacing w:after="80"/>
-      </w:pPr>
-      <w:r>
-        <w:t xml:space="preserve">图2：编译阶段 Kernel 分区划分</w:t>
-      </w:r>
-    </w:p>
-    <w:p>
-      <w:pPr>
-        <w:spacing w:after="80"/>
-      </w:pPr>
-      <w:r>
-        <w:t xml:space="preserve">图3：Task 切分与数据结构</w:t>
-      </w:r>
-    </w:p>
-    <w:p>
-      <w:pPr>
-        <w:spacing w:after="80"/>
-      </w:pPr>
-      <w:r>
-        <w:t xml:space="preserve">图4：共享内存布局</w:t>
-      </w:r>
-    </w:p>
-    <w:p>
-      <w:pPr>
-        <w:spacing w:after="80"/>
-      </w:pPr>
-      <w:r>
-        <w:t xml:space="preserve">图5：Daemon Warp 调度流程</w:t>
+        <w:t xml:space="preserve">图1：传统静态 Warp-Specialize 示意，展示现有技术中 Producer 和 Consumer 角色固定，运行时无法调整导致的空闲问题。</w:t>
+      </w:r>
+    </w:p>
+    <w:p>
+      <w:pPr>
+        <w:spacing w:after="80"/>
+      </w:pPr>
+      <w:r>
+        <w:t xml:space="preserve">图2：编译阶段 Kernel 分区划分，展示如何将原始 Kernel IR 按硬件操作类型划分为不同分区。</w:t>
+      </w:r>
+    </w:p>
+    <w:p>
+      <w:pPr>
+        <w:spacing w:after="80"/>
+      </w:pPr>
+      <w:r>
+        <w:t xml:space="preserve">图3：Task 切分与数据结构，展示 Task 描述符的结构和依赖关系的表示方法。</w:t>
+      </w:r>
+    </w:p>
+    <w:p>
+      <w:pPr>
+        <w:spacing w:after="80"/>
+      </w:pPr>
+      <w:r>
+        <w:t xml:space="preserve">图4：共享内存布局，展示运行时共享内存中 Task 描述符、Warp 状态表、硬件监控区的布局。</w:t>
+      </w:r>
+    </w:p>
+    <w:p>
+      <w:pPr>
+        <w:spacing w:after="80"/>
+      </w:pPr>
+      <w:r>
+        <w:t xml:space="preserve">图5：Daemon Warp 调度流程，展示 Daemon Warp 的完整调度循环：监控硬件、查找空闲 Warp、选择分区、选择 Task、分发执行。</w:t>
       </w:r>
     </w:p>
     <w:p>
@@ -1776,12 +1785,11 @@
         <w:spacing w:after="200"/>
       </w:pPr>
       <w:r>
-        <w:t xml:space="preserve">图6：执行时间线示意</w:t>
-      </w:r>
-    </w:p>
-    <w:p>
-      <w:pPr>
-        <w:pStyle w:val="Heading1"/>
+        <w:t xml:space="preserve">图6：执行时间线示意，展示多个 Warp 在 Daemon 调度下动态执行 Task 的时间线。</w:t>
+      </w:r>
+    </w:p>
+    <w:p>
+      <w:pPr>
         <w:spacing w:after="100" w:before="300"/>
       </w:pPr>
       <w:r>

</xml_diff>

<commit_message>
Update: glossary using colon format
</commit_message>
<xml_diff>
--- a/专利申请技术交底书_Warp动态调度.docx
+++ b/专利申请技术交底书_Warp动态调度.docx
@@ -193,277 +193,124 @@
     <w:p>
       <w:pPr>
         <w:pStyle w:val="Heading2"/>
-        <w:spacing w:after="200" w:before="200"/>
+        <w:spacing w:after="150" w:before="200"/>
       </w:pPr>
       <w:r>
         <w:t xml:space="preserve">缩略语和关键术语定义</w:t>
       </w:r>
     </w:p>
-    <w:tbl>
-      <w:tblPr>
-        <w:tblW w:type="pct" w:w="100%"/>
-        <w:tblBorders>
-          <w:top w:val="single" w:color="auto" w:sz="4"/>
-          <w:left w:val="single" w:color="auto" w:sz="4"/>
-          <w:bottom w:val="single" w:color="auto" w:sz="4"/>
-          <w:right w:val="single" w:color="auto" w:sz="4"/>
-          <w:insideH w:val="single" w:color="auto" w:sz="4"/>
-          <w:insideV w:val="single" w:color="auto" w:sz="4"/>
-        </w:tblBorders>
-      </w:tblPr>
-      <w:tblGrid>
-        <w:gridCol w:w="100"/>
-        <w:gridCol w:w="100"/>
-      </w:tblGrid>
-      <w:tr>
-        <w:tc>
-          <w:p>
-            <w:r>
-              <w:rPr>
-                <w:b/>
-                <w:bCs/>
-              </w:rPr>
-              <w:t xml:space="preserve">术语</w:t>
-            </w:r>
-          </w:p>
-        </w:tc>
-        <w:tc>
-          <w:p>
-            <w:r>
-              <w:rPr>
-                <w:b/>
-                <w:bCs/>
-              </w:rPr>
-              <w:t xml:space="preserve">定义</w:t>
-            </w:r>
-          </w:p>
-        </w:tc>
-      </w:tr>
-      <w:tr>
-        <w:tc>
-          <w:p>
-            <w:r>
-              <w:t xml:space="preserve">Warp</w:t>
-            </w:r>
-          </w:p>
-        </w:tc>
-        <w:tc>
-          <w:p>
-            <w:r>
-              <w:t xml:space="preserve">GPU 中的基本执行单元，AMD GPU 中为一个 Wave（64 线程），NVIDIA GPU 中为 32 线程的线程束</w:t>
-            </w:r>
-          </w:p>
-        </w:tc>
-      </w:tr>
-      <w:tr>
-        <w:tc>
-          <w:p>
-            <w:r>
-              <w:t xml:space="preserve">Warp-Specialize</w:t>
-            </w:r>
-          </w:p>
-        </w:tc>
-        <w:tc>
-          <w:p>
-            <w:r>
-              <w:t xml:space="preserve">Warp 特化技术，将一个 Warp 的线程划分为不同角色（Producer/Consumer），分别执行内存访问和计算</w:t>
-            </w:r>
-          </w:p>
-        </w:tc>
-      </w:tr>
-      <w:tr>
-        <w:tc>
-          <w:p>
-            <w:r>
-              <w:t xml:space="preserve">Producer</w:t>
-            </w:r>
-          </w:p>
-        </w:tc>
-        <w:tc>
-          <w:p>
-            <w:r>
-              <w:t xml:space="preserve">Warp-Specialize 中负责数据加载和内存操作的线程角色</w:t>
-            </w:r>
-          </w:p>
-        </w:tc>
-      </w:tr>
-      <w:tr>
-        <w:tc>
-          <w:p>
-            <w:r>
-              <w:t xml:space="preserve">Consumer</w:t>
-            </w:r>
-          </w:p>
-        </w:tc>
-        <w:tc>
-          <w:p>
-            <w:r>
-              <w:t xml:space="preserve">Warp-Specialize 中负责计算操作的线程角色</w:t>
-            </w:r>
-          </w:p>
-        </w:tc>
-      </w:tr>
-      <w:tr>
-        <w:tc>
-          <w:p>
-            <w:r>
-              <w:t xml:space="preserve">Warpgroup</w:t>
-            </w:r>
-          </w:p>
-        </w:tc>
-        <w:tc>
-          <w:p>
-            <w:r>
-              <w:t xml:space="preserve">AMD GPU 中的一组 Warps，用于协同执行任务</w:t>
-            </w:r>
-          </w:p>
-        </w:tc>
-      </w:tr>
-      <w:tr>
-        <w:tc>
-          <w:p>
-            <w:r>
-              <w:t xml:space="preserve">VGPR</w:t>
-            </w:r>
-          </w:p>
-        </w:tc>
-        <w:tc>
-          <w:p>
-            <w:r>
-              <w:t xml:space="preserve">向量通用寄存器（Vector General-Purpose Register），GPU 中用于存储线程执行数据的寄存器</w:t>
-            </w:r>
-          </w:p>
-        </w:tc>
-      </w:tr>
-      <w:tr>
-        <w:tc>
-          <w:p>
-            <w:r>
-              <w:t xml:space="preserve">SGPR</w:t>
-            </w:r>
-          </w:p>
-        </w:tc>
-        <w:tc>
-          <w:p>
-            <w:r>
-              <w:t xml:space="preserve">标量通用寄存器（Scalar General-Purpose Register），GPU 中用于存储线程间共享数据的寄存器</w:t>
-            </w:r>
-          </w:p>
-        </w:tc>
-      </w:tr>
-      <w:tr>
-        <w:tc>
-          <w:p>
-            <w:r>
-              <w:t xml:space="preserve">Kernel</w:t>
-            </w:r>
-          </w:p>
-        </w:tc>
-        <w:tc>
-          <w:p>
-            <w:r>
-              <w:t xml:space="preserve">GPU 核函数，在 GPU 上执行的并行计算函数</w:t>
-            </w:r>
-          </w:p>
-        </w:tc>
-      </w:tr>
-      <w:tr>
-        <w:tc>
-          <w:p>
-            <w:r>
-              <w:t xml:space="preserve">Partition</w:t>
-            </w:r>
-          </w:p>
-        </w:tc>
-        <w:tc>
-          <w:p>
-            <w:r>
-              <w:t xml:space="preserve">分区，编译时将 Kernel 按硬件单元使用类型划分成的不同部分</w:t>
-            </w:r>
-          </w:p>
-        </w:tc>
-      </w:tr>
-      <w:tr>
-        <w:tc>
-          <w:p>
-            <w:r>
-              <w:t xml:space="preserve">Task</w:t>
-            </w:r>
-          </w:p>
-        </w:tc>
-        <w:tc>
-          <w:p>
-            <w:r>
-              <w:t xml:space="preserve">任务，Partition 按数据维度切分后的最小执行单元</w:t>
-            </w:r>
-          </w:p>
-        </w:tc>
-      </w:tr>
-      <w:tr>
-        <w:tc>
-          <w:p>
-            <w:r>
-              <w:t xml:space="preserve">Daemon Warp</w:t>
-            </w:r>
-          </w:p>
-        </w:tc>
-        <w:tc>
-          <w:p>
-            <w:r>
-              <w:t xml:space="preserve">调度器 Warp，运行时负责监控硬件状态并调度任务执行的特殊 Warp</w:t>
-            </w:r>
-          </w:p>
-        </w:tc>
-      </w:tr>
-      <w:tr>
-        <w:tc>
-          <w:p>
-            <w:r>
-              <w:t xml:space="preserve">IR</w:t>
-            </w:r>
-          </w:p>
-        </w:tc>
-        <w:tc>
-          <w:p>
-            <w:r>
-              <w:t xml:space="preserve">中间表示（Intermediate Representation），编译器中用于表示源代码的中间格式</w:t>
-            </w:r>
-          </w:p>
-        </w:tc>
-      </w:tr>
-      <w:tr>
-        <w:tc>
-          <w:p>
-            <w:r>
-              <w:t xml:space="preserve">SIMD</w:t>
-            </w:r>
-          </w:p>
-        </w:tc>
-        <w:tc>
-          <w:p>
-            <w:r>
-              <w:t xml:space="preserve">单指令多数据（Single Instruction Multiple Data），GPU 的并行执行模式</w:t>
-            </w:r>
-          </w:p>
-        </w:tc>
-      </w:tr>
-      <w:tr>
-        <w:tc>
-          <w:p>
-            <w:r>
-              <w:t xml:space="preserve">MFMA</w:t>
-            </w:r>
-          </w:p>
-        </w:tc>
-        <w:tc>
-          <w:p>
-            <w:r>
-              <w:t xml:space="preserve">矩阵融合乘加（Matrix Fused Multiply-Add），AMD GPU 的矩阵运算指令</w:t>
-            </w:r>
-          </w:p>
-        </w:tc>
-      </w:tr>
-    </w:tbl>
+    <w:p>
+      <w:pPr>
+        <w:spacing w:after="60"/>
+      </w:pPr>
+      <w:r>
+        <w:t xml:space="preserve">Warp：GPU 中的基本执行单元，AMD GPU 中为一个 Wave（64 线程），NVIDIA GPU 中为 32 线程的线程束</w:t>
+      </w:r>
+    </w:p>
+    <w:p>
+      <w:pPr>
+        <w:spacing w:after="60"/>
+      </w:pPr>
+      <w:r>
+        <w:t xml:space="preserve">Warp-Specialize：Warp 特化技术，将一个 Warp 的线程划分为不同角色（Producer/Consumer），分别执行内存访问和计算</w:t>
+      </w:r>
+    </w:p>
+    <w:p>
+      <w:pPr>
+        <w:spacing w:after="60"/>
+      </w:pPr>
+      <w:r>
+        <w:t xml:space="preserve">Producer：Warp-Specialize 中负责数据加载和内存操作的线程角色</w:t>
+      </w:r>
+    </w:p>
+    <w:p>
+      <w:pPr>
+        <w:spacing w:after="60"/>
+      </w:pPr>
+      <w:r>
+        <w:t xml:space="preserve">Consumer：Warp-Specialize 中负责计算操作的线程角色</w:t>
+      </w:r>
+    </w:p>
+    <w:p>
+      <w:pPr>
+        <w:spacing w:after="60"/>
+      </w:pPr>
+      <w:r>
+        <w:t xml:space="preserve">Warpgroup：AMD GPU 中的一组 Warps，用于协同执行任务</w:t>
+      </w:r>
+    </w:p>
+    <w:p>
+      <w:pPr>
+        <w:spacing w:after="60"/>
+      </w:pPr>
+      <w:r>
+        <w:t xml:space="preserve">VGPR：向量通用寄存器（Vector General-Purpose Register），GPU 中用于存储线程执行数据的寄存器</w:t>
+      </w:r>
+    </w:p>
+    <w:p>
+      <w:pPr>
+        <w:spacing w:after="60"/>
+      </w:pPr>
+      <w:r>
+        <w:t xml:space="preserve">SGPR：标量通用寄存器（Scalar General-Purpose Register），GPU 中用于存储线程间共享数据的寄存器</w:t>
+      </w:r>
+    </w:p>
+    <w:p>
+      <w:pPr>
+        <w:spacing w:after="60"/>
+      </w:pPr>
+      <w:r>
+        <w:t xml:space="preserve">Kernel：GPU 核函数，在 GPU 上执行的并行计算函数</w:t>
+      </w:r>
+    </w:p>
+    <w:p>
+      <w:pPr>
+        <w:spacing w:after="60"/>
+      </w:pPr>
+      <w:r>
+        <w:t xml:space="preserve">Partition：分区，编译时将 Kernel 按硬件单元使用类型划分成的不同部分</w:t>
+      </w:r>
+    </w:p>
+    <w:p>
+      <w:pPr>
+        <w:spacing w:after="60"/>
+      </w:pPr>
+      <w:r>
+        <w:t xml:space="preserve">Task：任务，Partition 按数据维度切分后的最小执行单元</w:t>
+      </w:r>
+    </w:p>
+    <w:p>
+      <w:pPr>
+        <w:spacing w:after="60"/>
+      </w:pPr>
+      <w:r>
+        <w:t xml:space="preserve">Daemon Warp：调度器 Warp，运行时负责监控硬件状态并调度任务执行的特殊 Warp</w:t>
+      </w:r>
+    </w:p>
+    <w:p>
+      <w:pPr>
+        <w:spacing w:after="60"/>
+      </w:pPr>
+      <w:r>
+        <w:t xml:space="preserve">IR：中间表示（Intermediate Representation），编译器中用于表示源代码的中间格式</w:t>
+      </w:r>
+    </w:p>
+    <w:p>
+      <w:pPr>
+        <w:spacing w:after="60"/>
+      </w:pPr>
+      <w:r>
+        <w:t xml:space="preserve">SIMD：单指令多数据（Single Instruction Multiple Data），GPU 的并行执行模式</w:t>
+      </w:r>
+    </w:p>
+    <w:p>
+      <w:pPr>
+        <w:spacing w:after="60"/>
+      </w:pPr>
+      <w:r>
+        <w:t xml:space="preserve">MFMA：矩阵融合乘加（Matrix Fused Multiply-Add），AMD GPU 的矩阵运算指令</w:t>
+      </w:r>
+    </w:p>
     <w:p>
       <w:pPr>
         <w:spacing w:after="400"/>

</xml_diff>

<commit_message>
Update: technical effects as bullet points, enhanced content
</commit_message>
<xml_diff>
--- a/专利申请技术交底书_Warp动态调度.docx
+++ b/专利申请技术交底书_Warp动态调度.docx
@@ -425,20 +425,20 @@
     </w:p>
     <w:p>
       <w:pPr>
-        <w:spacing w:after="80"/>
-        <w:ind w:left="720"/>
-      </w:pPr>
-      <w:r>
-        <w:t xml:space="preserve">技术方案：在编译阶段静态划分 Warp 的角色，运行时 Producer 和 Consumer 的分工固定不变。</w:t>
-      </w:r>
-    </w:p>
-    <w:p>
-      <w:pPr>
-        <w:spacing w:after="80"/>
-        <w:ind w:left="720"/>
-      </w:pPr>
-      <w:r>
-        <w:t xml:space="preserve">代表实现：Triton 语言的 tt.create_group 原语</w:t>
+        <w:spacing w:after="100"/>
+        <w:ind w:left="720"/>
+      </w:pPr>
+      <w:r>
+        <w:t xml:space="preserve">技术方案：在编译阶段静态划分 Warp 的角色，运行时 Producer 和 Consumer 的分工固定不变。具体实现方式为在 Kernel 源代码中使用特定的编译器指令（如 Triton 语言的 tt.create_group 原语）将一个 Warp 内的线程划分为两个（或多个）角色，其中一部分线程始终担任 Producer 角色负责内存访问，另一部分线程始终担任 Consumer 角色负责计算。编译时确定角色划分后，运行时按照编译时确定的方式执行，Producer 和 Consumer 的分工不会发生改变。</w:t>
+      </w:r>
+    </w:p>
+    <w:p>
+      <w:pPr>
+        <w:spacing w:after="100"/>
+        <w:ind w:left="720"/>
+      </w:pPr>
+      <w:r>
+        <w:t xml:space="preserve">代表实现：Triton 语言的 tt.create_group 原语、NVIDIA CUDA 中的双 Producer 模式等。</w:t>
       </w:r>
     </w:p>
     <w:p>
@@ -447,7 +447,7 @@
         <w:ind w:left="720"/>
       </w:pPr>
       <w:r>
-        <w:t xml:space="preserve">缺点：在编译时确定角色，无法适应运行时变化；当 Producer 和 Consumer 工作量差异较大时，一方会空闲等待；无法根据硬件资源占用情况动态调整任务分配。</w:t>
+        <w:t xml:space="preserve">缺点：（1）在编译时确定角色，无法适应运行时变化，当实际数据规模或硬件状态与编译时假设不符时，负载分配不合理；（2）当 Producer 和 Consumer 工作量差异较大时，一方会空闲等待，导致硬件资源浪费；（3）无法根据硬件资源占用情况动态调整任务分配，无法应对运行时的工作负载波动。</w:t>
       </w:r>
     </w:p>
     <w:p>
@@ -1043,23 +1043,23 @@
         <w:spacing w:after="150"/>
       </w:pPr>
       <w:r>
-        <w:t xml:space="preserve">在编译阶段，分析 Kernel 代码的 IR（中间表示），识别不同类型的硬件操作：</w:t>
-      </w:r>
-    </w:p>
-    <w:p>
-      <w:pPr>
-        <w:spacing w:after="80"/>
-      </w:pPr>
-      <w:r>
-        <w:t xml:space="preserve">内存分区（Partition-M）：主要执行内存访问操作（Load/Store）的代码区域</w:t>
-      </w:r>
-    </w:p>
-    <w:p>
-      <w:pPr>
-        <w:spacing w:after="80"/>
-      </w:pPr>
-      <w:r>
-        <w:t xml:space="preserve">计算分区（Partition-C）：主要执行计算密集型操作（MFMA、ALU）的代码区域</w:t>
+        <w:t xml:space="preserve">在编译阶段，分析 Kernel 代码的 IR（中间表示），识别不同类型的硬件操作，按照硬件单元使用类型将 Kernel 划分为不同的分区（Partition）：</w:t>
+      </w:r>
+    </w:p>
+    <w:p>
+      <w:pPr>
+        <w:spacing w:after="80"/>
+      </w:pPr>
+      <w:r>
+        <w:t xml:space="preserve">内存分区（Partition-M）：主要执行内存访问操作（Load/Store）的代码区域，这类分区内的代码以数据加载和结果存储为主，计算量较小</w:t>
+      </w:r>
+    </w:p>
+    <w:p>
+      <w:pPr>
+        <w:spacing w:after="80"/>
+      </w:pPr>
+      <w:r>
+        <w:t xml:space="preserve">计算分区（Partition-C）：主要执行计算密集型操作（MFMA、ALU）的代码区域，这类分区内的代码以数值计算为主，几乎不涉及内存访问</w:t>
       </w:r>
     </w:p>
     <w:p>
@@ -1067,7 +1067,7 @@
         <w:spacing w:after="200"/>
       </w:pPr>
       <w:r>
-        <w:t xml:space="preserve">混合分区（Partition-H）：同时包含内存和计算操作的代码区域</w:t>
+        <w:t xml:space="preserve">混合分区（Partition-H）：同时包含内存访问和计算操作的代码区域，这类分区需要同时使用内存带宽和计算单元</w:t>
       </w:r>
     </w:p>
     <w:p>
@@ -1081,10 +1081,46 @@
     </w:p>
     <w:p>
       <w:pPr>
+        <w:spacing w:after="150"/>
+      </w:pPr>
+      <w:r>
+        <w:t xml:space="preserve">在完成分区划分后，每个 Partition 按照数据维度进一步切分为多个 Task（任务），每个 Task 是调度的最小单位。同时，在编译阶段预计算每个 Task 执行所需的所有输入信息，包括：</w:t>
+      </w:r>
+    </w:p>
+    <w:p>
+      <w:pPr>
+        <w:spacing w:after="60"/>
+        <w:ind w:left="720"/>
+      </w:pPr>
+      <w:r>
+        <w:t xml:space="preserve">（1）输入数据地址：Task 所需输入数据在全局内存或共享内存中的地址偏移量</w:t>
+      </w:r>
+    </w:p>
+    <w:p>
+      <w:pPr>
+        <w:spacing w:after="60"/>
+        <w:ind w:left="720"/>
+      </w:pPr>
+      <w:r>
+        <w:t xml:space="preserve">（2）输出数据地址：Task 计算结果写入的位置</w:t>
+      </w:r>
+    </w:p>
+    <w:p>
+      <w:pPr>
+        <w:spacing w:after="60"/>
+        <w:ind w:left="720"/>
+      </w:pPr>
+      <w:r>
+        <w:t xml:space="preserve">（3）执行参数：Task 执行所需的参数，如分块大小、步长等</w:t>
+      </w:r>
+    </w:p>
+    <w:p>
+      <w:pPr>
         <w:spacing w:after="200"/>
-      </w:pPr>
-      <w:r>
-        <w:t xml:space="preserve">每个 Partition 按照数据维度进一步切分为多个 Task，并预计算每个 Task 的输入。</w:t>
+        <w:ind w:left="720"/>
+      </w:pPr>
+      <w:r>
+        <w:t xml:space="preserve">（4）依赖关系：Task 与其他 Task 之间的数据依赖关系，用依赖掩码表示</w:t>
       </w:r>
     </w:p>
     <w:p>
@@ -1101,7 +1137,7 @@
         <w:spacing w:after="200"/>
       </w:pPr>
       <w:r>
-        <w:t xml:space="preserve">编译阶段生成两部分代码：（1）Task 执行代码：每个 Task 的具体实现编译成的机器码；（2）Daemon 调度代码：运行时 Daemon Warp 执行的调度逻辑。</w:t>
+        <w:t xml:space="preserve">编译阶段生成两部分核心代码：（1）Task 执行代码：每个 Task 的具体实现编译成的机器码，这些代码在运行时由空闲 Warp 执行；（2）Daemon 调度代码：运行时由 Daemon Warp 执行的调度逻辑，包括硬件状态监控、空闲 Warp 查找、分区选择、Task 选择和分发等功能的机器码。</w:t>
       </w:r>
     </w:p>
     <w:p>
@@ -1127,7 +1163,7 @@
         <w:spacing w:after="200"/>
       </w:pPr>
       <w:r>
-        <w:t xml:space="preserve">Kernel 启动时，将 Task 描述符数组加载到共享内存。</w:t>
+        <w:t xml:space="preserve">Kernel 启动时，将编译阶段生成的 Task 描述符数组、调度代码、以及相关数据结构加载到共享内存中。同时初始化硬件状态监控区域和 Warp 状态表，为后续的动态调度做好准备。</w:t>
       </w:r>
     </w:p>
     <w:p>
@@ -1141,10 +1177,55 @@
     </w:p>
     <w:p>
       <w:pPr>
+        <w:spacing w:after="150"/>
+      </w:pPr>
+      <w:r>
+        <w:t xml:space="preserve">Daemon Warp 是本发明的核心创新点，它是一个特殊用途的 Warp，在整个 Kernel 执行期间持续运行，负责整体的调度协调工作。其调度主循环包括以下步骤：</w:t>
+      </w:r>
+    </w:p>
+    <w:p>
+      <w:pPr>
+        <w:spacing w:after="60"/>
+        <w:ind w:left="720"/>
+      </w:pPr>
+      <w:r>
+        <w:t xml:space="preserve">（1）硬件状态监控：Daemon Warp 通过读取硬件性能计数器（如内存带宽利用率、计算单元利用率等），实时感知当前硬件资源的使用状况</w:t>
+      </w:r>
+    </w:p>
+    <w:p>
+      <w:pPr>
+        <w:spacing w:after="60"/>
+        <w:ind w:left="720"/>
+      </w:pPr>
+      <w:r>
+        <w:t xml:space="preserve">（2）空闲 Warp 查找：扫描 Warp 状态表，查找当前处于空闲状态的 Warp，作为 Task 的执行者</w:t>
+      </w:r>
+    </w:p>
+    <w:p>
+      <w:pPr>
+        <w:spacing w:after="60"/>
+        <w:ind w:left="720"/>
+      </w:pPr>
+      <w:r>
+        <w:t xml:space="preserve">（3）分区类型选择：根据硬件状态决定当前应优先调度哪种类型的 Partition，例如当内存带宽紧张时应优先调度计算型 Task</w:t>
+      </w:r>
+    </w:p>
+    <w:p>
+      <w:pPr>
+        <w:spacing w:after="60"/>
+        <w:ind w:left="720"/>
+      </w:pPr>
+      <w:r>
+        <w:t xml:space="preserve">（4）Task 筛选：在选中的 Partition 类型中，根据依赖关系筛选出满足执行条件的就绪 Task</w:t>
+      </w:r>
+    </w:p>
+    <w:p>
+      <w:pPr>
         <w:spacing w:after="200"/>
-      </w:pPr>
-      <w:r>
-        <w:t xml:space="preserve">Daemon Warp 持续监控硬件资源占用情况，查找空闲 Warp，根据硬件状态选择合适的 Partition 和满足依赖的 Task，分发给空闲的 Warp 执行。</w:t>
+        <w:ind w:left="720"/>
+      </w:pPr>
+      <w:r>
+        <w:t xml:space="preserve">（5）Task 分发：将选中的 Task 分发给空闲的 Warp 执行，并更新相关状态</w:t>
       </w:r>
     </w:p>
     <w:p>
@@ -1161,7 +1242,7 @@
         <w:spacing w:after="400"/>
       </w:pPr>
       <w:r>
-        <w:t xml:space="preserve">本发明采用"编译时分区加运行时动态调度"的架构，与传统静态 Warp-Specialize 的核心区别在于：分工时机从编译时变为运行时，任务分配从固定角色变为 Daemon 根据状态动态分配，实现了真正的自适应负载均衡。</w:t>
+        <w:t xml:space="preserve">本发明采用"编译时分区加运行时动态调度"的创新架构，与传统静态 Warp-Specialize 的核心区别在于：（1）分工时机从编译时静态确定变为运行时动态决策；（2）任务分配从固定角色分配变为 Daemon 根据硬件状态动态分配；（3）负载均衡从依赖编译时分析变为运行时自适应调整。这种架构使得本发明能够真正响应运行时硬件状态变化，实现最优的资源利用率。</w:t>
       </w:r>
     </w:p>
     <w:p>
@@ -1173,224 +1254,69 @@
         <w:t xml:space="preserve">技术效果</w:t>
       </w:r>
     </w:p>
-    <w:tbl>
-      <w:tblPr>
-        <w:tblW w:type="pct" w:w="100%"/>
-        <w:tblBorders>
-          <w:top w:val="single" w:color="auto" w:sz="4"/>
-          <w:left w:val="single" w:color="auto" w:sz="4"/>
-          <w:bottom w:val="single" w:color="auto" w:sz="4"/>
-          <w:right w:val="single" w:color="auto" w:sz="4"/>
-          <w:insideH w:val="single" w:color="auto" w:sz="4"/>
-          <w:insideV w:val="single" w:color="auto" w:sz="4"/>
-        </w:tblBorders>
-      </w:tblPr>
-      <w:tblGrid>
-        <w:gridCol w:w="100"/>
-        <w:gridCol w:w="100"/>
-        <w:gridCol w:w="100"/>
-      </w:tblGrid>
-      <w:tr>
-        <w:tc>
-          <w:p>
-            <w:r>
-              <w:rPr>
-                <w:b/>
-                <w:bCs/>
-              </w:rPr>
-              <w:t xml:space="preserve">序号</w:t>
-            </w:r>
-          </w:p>
-        </w:tc>
-        <w:tc>
-          <w:p>
-            <w:r>
-              <w:rPr>
-                <w:b/>
-                <w:bCs/>
-              </w:rPr>
-              <w:t xml:space="preserve">效果</w:t>
-            </w:r>
-          </w:p>
-        </w:tc>
-        <w:tc>
-          <w:p>
-            <w:r>
-              <w:rPr>
-                <w:b/>
-                <w:bCs/>
-              </w:rPr>
-              <w:t xml:space="preserve">说明</w:t>
-            </w:r>
-          </w:p>
-        </w:tc>
-      </w:tr>
-      <w:tr>
-        <w:tc>
-          <w:p>
-            <w:r>
-              <w:t xml:space="preserve">1</w:t>
-            </w:r>
-          </w:p>
-        </w:tc>
-        <w:tc>
-          <w:p>
-            <w:r>
-              <w:t xml:space="preserve">负载均衡</w:t>
-            </w:r>
-          </w:p>
-        </w:tc>
-        <w:tc>
-          <w:p>
-            <w:r>
-              <w:t xml:space="preserve">通过运行时动态调度，自动适应不同阶段的负载变化，避免 Warp 空闲</w:t>
-            </w:r>
-          </w:p>
-        </w:tc>
-      </w:tr>
-      <w:tr>
-        <w:tc>
-          <w:p>
-            <w:r>
-              <w:t xml:space="preserve">2</w:t>
-            </w:r>
-          </w:p>
-        </w:tc>
-        <w:tc>
-          <w:p>
-            <w:r>
-              <w:t xml:space="preserve">资源最大化利用</w:t>
-            </w:r>
-          </w:p>
-        </w:tc>
-        <w:tc>
-          <w:p>
-            <w:r>
-              <w:t xml:space="preserve">Daemon 根据硬件资源占用情况智能分配任务，始终保持高利用率</w:t>
-            </w:r>
-          </w:p>
-        </w:tc>
-      </w:tr>
-      <w:tr>
-        <w:tc>
-          <w:p>
-            <w:r>
-              <w:t xml:space="preserve">3</w:t>
-            </w:r>
-          </w:p>
-        </w:tc>
-        <w:tc>
-          <w:p>
-            <w:r>
-              <w:t xml:space="preserve">低开销</w:t>
-            </w:r>
-          </w:p>
-        </w:tc>
-        <w:tc>
-          <w:p>
-            <w:r>
-              <w:t xml:space="preserve">仅使用一个 Warp 作为 Daemon，开销极低</w:t>
-            </w:r>
-          </w:p>
-        </w:tc>
-      </w:tr>
-      <w:tr>
-        <w:tc>
-          <w:p>
-            <w:r>
-              <w:t xml:space="preserve">4</w:t>
-            </w:r>
-          </w:p>
-        </w:tc>
-        <w:tc>
-          <w:p>
-            <w:r>
-              <w:t xml:space="preserve">高灵活性</w:t>
-            </w:r>
-          </w:p>
-        </w:tc>
-        <w:tc>
-          <w:p>
-            <w:r>
-              <w:t xml:space="preserve">可处理复杂的条件分支和动态数据依赖</w:t>
-            </w:r>
-          </w:p>
-        </w:tc>
-      </w:tr>
-      <w:tr>
-        <w:tc>
-          <w:p>
-            <w:r>
-              <w:t xml:space="preserve">5</w:t>
-            </w:r>
-          </w:p>
-        </w:tc>
-        <w:tc>
-          <w:p>
-            <w:r>
-              <w:t xml:space="preserve">易于实现</w:t>
-            </w:r>
-          </w:p>
-        </w:tc>
-        <w:tc>
-          <w:p>
-            <w:r>
-              <w:t xml:space="preserve">编译器自动完成分区和 Task 切分，无需开发者手动管理</w:t>
-            </w:r>
-          </w:p>
-        </w:tc>
-      </w:tr>
-      <w:tr>
-        <w:tc>
-          <w:p>
-            <w:r>
-              <w:t xml:space="preserve">6</w:t>
-            </w:r>
-          </w:p>
-        </w:tc>
-        <w:tc>
-          <w:p>
-            <w:r>
-              <w:t xml:space="preserve">可扩展性强</w:t>
-            </w:r>
-          </w:p>
-        </w:tc>
-        <w:tc>
-          <w:p>
-            <w:r>
-              <w:t xml:space="preserve">可容易地添加新的调度策略</w:t>
-            </w:r>
-          </w:p>
-        </w:tc>
-      </w:tr>
-      <w:tr>
-        <w:tc>
-          <w:p>
-            <w:r>
-              <w:t xml:space="preserve">7</w:t>
-            </w:r>
-          </w:p>
-        </w:tc>
-        <w:tc>
-          <w:p>
-            <w:r>
-              <w:t xml:space="preserve">适配国产 GPU</w:t>
-            </w:r>
-          </w:p>
-        </w:tc>
-        <w:tc>
-          <w:p>
-            <w:r>
-              <w:t xml:space="preserve">针对 DCU 特性设计，发挥硬件特有能力</w:t>
-            </w:r>
-          </w:p>
-        </w:tc>
-      </w:tr>
-    </w:tbl>
+    <w:p>
+      <w:pPr>
+        <w:spacing w:after="150"/>
+      </w:pPr>
+      <w:r>
+        <w:t xml:space="preserve">本发明与现有技术相比，具有以下显著的技术效果：</w:t>
+      </w:r>
+    </w:p>
+    <w:p>
+      <w:pPr>
+        <w:spacing w:after="100"/>
+      </w:pPr>
+      <w:r>
+        <w:t xml:space="preserve">（1）负载均衡：通过运行时动态调度，自动适应不同阶段的负载变化，避免 Warp 空闲</w:t>
+      </w:r>
+    </w:p>
+    <w:p>
+      <w:pPr>
+        <w:spacing w:after="100"/>
+      </w:pPr>
+      <w:r>
+        <w:t xml:space="preserve">（2）资源最大化利用：Daemon 根据硬件资源占用情况智能分配任务，始终保持高利用率</w:t>
+      </w:r>
+    </w:p>
+    <w:p>
+      <w:pPr>
+        <w:spacing w:after="100"/>
+      </w:pPr>
+      <w:r>
+        <w:t xml:space="preserve">（3）低开销：仅使用一个 Warp 作为 Daemon，开销极低</w:t>
+      </w:r>
+    </w:p>
+    <w:p>
+      <w:pPr>
+        <w:spacing w:after="100"/>
+      </w:pPr>
+      <w:r>
+        <w:t xml:space="preserve">（4）高灵活性：可处理复杂的条件分支和动态数据依赖</w:t>
+      </w:r>
+    </w:p>
+    <w:p>
+      <w:pPr>
+        <w:spacing w:after="100"/>
+      </w:pPr>
+      <w:r>
+        <w:t xml:space="preserve">（5）易于实现：编译器自动完成分区和 Task 切分，无需开发者手动管理</w:t>
+      </w:r>
+    </w:p>
+    <w:p>
+      <w:pPr>
+        <w:spacing w:after="100"/>
+      </w:pPr>
+      <w:r>
+        <w:t xml:space="preserve">（6）可扩展性强：可容易地添加新的调度策略</w:t>
+      </w:r>
+    </w:p>
     <w:p>
       <w:pPr>
         <w:spacing w:after="400"/>
       </w:pPr>
+      <w:r>
+        <w:t xml:space="preserve">（7）适配国产 GPU：针对 DCU 特性设计，发挥硬件特有能力（如差异化 VGPR 分配）</w:t>
+      </w:r>
     </w:p>
     <w:p>
       <w:pPr>

</xml_diff>